<commit_message>
Updated Policy generation document
</commit_message>
<xml_diff>
--- a/client/public/Policy_Schedule_Template.docx
+++ b/client/public/Policy_Schedule_Template.docx
@@ -2,118 +2,8 @@
 <file path=word/document.xml><?xml version="1.0" encoding="utf-8"?>
 <w:document xmlns:wpc="http://schemas.microsoft.com/office/word/2010/wordprocessingCanvas" xmlns:cx="http://schemas.microsoft.com/office/drawing/2014/chartex" xmlns:cx1="http://schemas.microsoft.com/office/drawing/2015/9/8/chartex" xmlns:cx2="http://schemas.microsoft.com/office/drawing/2015/10/21/chartex" xmlns:cx3="http://schemas.microsoft.com/office/drawing/2016/5/9/chartex" xmlns:cx4="http://schemas.microsoft.com/office/drawing/2016/5/10/chartex" xmlns:cx5="http://schemas.microsoft.com/office/drawing/2016/5/11/chartex" xmlns:cx6="http://schemas.microsoft.com/office/drawing/2016/5/12/chartex" xmlns:cx7="http://schemas.microsoft.com/office/drawing/2016/5/13/chartex" xmlns:cx8="http://schemas.microsoft.com/office/drawing/2016/5/14/chartex" xmlns:mc="http://schemas.openxmlformats.org/markup-compatibility/2006" xmlns:aink="http://schemas.microsoft.com/office/drawing/2016/ink" xmlns:am3d="http://schemas.microsoft.com/office/drawing/2017/model3d" xmlns:o="urn:schemas-microsoft-com:office:office" xmlns:oel="http://schemas.microsoft.com/office/2019/extlst" xmlns:r="http://schemas.openxmlformats.org/officeDocument/2006/relationships" xmlns:m="http://schemas.openxmlformats.org/officeDocument/2006/math" xmlns:v="urn:schemas-microsoft-com:vml" xmlns:wp14="http://schemas.microsoft.com/office/word/2010/wordprocessingDrawing" xmlns:wp="http://schemas.openxmlformats.org/drawingml/2006/wordprocessingDrawing" xmlns:w10="urn:schemas-microsoft-com:office:word" xmlns:w="http://schemas.openxmlformats.org/wordprocessingml/2006/main" xmlns:w14="http://schemas.microsoft.com/office/word/2010/wordml" xmlns:w15="http://schemas.microsoft.com/office/word/2012/wordml" xmlns:w16cex="http://schemas.microsoft.com/office/word/2018/wordml/cex" xmlns:w16cid="http://schemas.microsoft.com/office/word/2016/wordml/cid" xmlns:w16="http://schemas.microsoft.com/office/word/2018/wordml" xmlns:w16du="http://schemas.microsoft.com/office/word/2023/wordml/word16du" xmlns:w16sdtdh="http://schemas.microsoft.com/office/word/2020/wordml/sdtdatahash" xmlns:w16sdtfl="http://schemas.microsoft.com/office/word/2024/wordml/sdtformatlock" xmlns:w16se="http://schemas.microsoft.com/office/word/2015/wordml/symex" xmlns:wpg="http://schemas.microsoft.com/office/word/2010/wordprocessingGroup" xmlns:wpi="http://schemas.microsoft.com/office/word/2010/wordprocessingInk" xmlns:wne="http://schemas.microsoft.com/office/word/2006/wordml" xmlns:wps="http://schemas.microsoft.com/office/word/2010/wordprocessingShape" mc:Ignorable="w14 w15 w16se w16cid w16 w16cex w16sdtdh w16sdtfl w16du wp14">
   <w:body>
-    <w:tbl>
-      <w:tblPr>
-        <w:tblStyle w:val="TableGrid"/>
-        <w:tblW w:w="9351" w:type="dxa"/>
-        <w:tblBorders>
-          <w:top w:val="none" w:sz="0" w:space="0" w:color="auto"/>
-          <w:left w:val="none" w:sz="0" w:space="0" w:color="auto"/>
-          <w:bottom w:val="none" w:sz="0" w:space="0" w:color="auto"/>
-          <w:right w:val="none" w:sz="0" w:space="0" w:color="auto"/>
-          <w:insideH w:val="none" w:sz="0" w:space="0" w:color="auto"/>
-          <w:insideV w:val="none" w:sz="0" w:space="0" w:color="auto"/>
-        </w:tblBorders>
-        <w:tblLook w:val="04A0" w:firstRow="1" w:lastRow="0" w:firstColumn="1" w:lastColumn="0" w:noHBand="0" w:noVBand="1"/>
-      </w:tblPr>
-      <w:tblGrid>
-        <w:gridCol w:w="3828"/>
-        <w:gridCol w:w="1508"/>
-        <w:gridCol w:w="4015"/>
-      </w:tblGrid>
-      <w:tr>
-        <w:tc>
-          <w:tcPr>
-            <w:tcW w:w="3828" w:type="dxa"/>
-          </w:tcPr>
-          <w:p>
-            <w:pPr>
-              <w:rPr>
-                <w:rFonts w:ascii="Aptos" w:hAnsi="Aptos"/>
-                <w:sz w:val="24"/>
-                <w:szCs w:val="24"/>
-              </w:rPr>
-            </w:pPr>
-          </w:p>
-          <w:p>
-            <w:pPr>
-              <w:rPr>
-                <w:rFonts w:ascii="Aptos" w:hAnsi="Aptos"/>
-              </w:rPr>
-            </w:pPr>
-          </w:p>
-        </w:tc>
-        <w:tc>
-          <w:tcPr>
-            <w:tcW w:w="1508" w:type="dxa"/>
-          </w:tcPr>
-          <w:p>
-            <w:pPr>
-              <w:jc w:val="right"/>
-            </w:pPr>
-          </w:p>
-        </w:tc>
-        <w:tc>
-          <w:tcPr>
-            <w:tcW w:w="4015" w:type="dxa"/>
-          </w:tcPr>
-          <w:p>
-            <w:pPr>
-              <w:jc w:val="right"/>
-            </w:pPr>
-            <w:r>
-              <w:rPr>
-                <w:noProof/>
-              </w:rPr>
-              <w:drawing>
-                <wp:inline distT="0" distB="0" distL="0" distR="0" wp14:anchorId="6CDA9F00" wp14:editId="16635755">
-                  <wp:extent cx="1336150" cy="380366"/>
-                  <wp:effectExtent l="0" t="0" r="0" b="635"/>
-                  <wp:docPr id="37082050" name="Graphic 1"/>
-                  <wp:cNvGraphicFramePr>
-                    <a:graphicFrameLocks xmlns:a="http://schemas.openxmlformats.org/drawingml/2006/main" noChangeAspect="1"/>
-                  </wp:cNvGraphicFramePr>
-                  <a:graphic xmlns:a="http://schemas.openxmlformats.org/drawingml/2006/main">
-                    <a:graphicData uri="http://schemas.openxmlformats.org/drawingml/2006/picture">
-                      <pic:pic xmlns:pic="http://schemas.openxmlformats.org/drawingml/2006/picture">
-                        <pic:nvPicPr>
-                          <pic:cNvPr id="37082050" name=""/>
-                          <pic:cNvPicPr/>
-                        </pic:nvPicPr>
-                        <pic:blipFill>
-                          <a:blip r:embed="rId7">
-                            <a:extLst>
-                              <a:ext uri="{96DAC541-7B7A-43D3-8B79-37D633B846F1}">
-                                <asvg:svgBlip xmlns:asvg="http://schemas.microsoft.com/office/drawing/2016/SVG/main" r:embed="rId8"/>
-                              </a:ext>
-                            </a:extLst>
-                          </a:blip>
-                          <a:stretch>
-                            <a:fillRect/>
-                          </a:stretch>
-                        </pic:blipFill>
-                        <pic:spPr>
-                          <a:xfrm>
-                            <a:off x="0" y="0"/>
-                            <a:ext cx="1363786" cy="388233"/>
-                          </a:xfrm>
-                          <a:prstGeom prst="rect">
-                            <a:avLst/>
-                          </a:prstGeom>
-                        </pic:spPr>
-                      </pic:pic>
-                    </a:graphicData>
-                  </a:graphic>
-                </wp:inline>
-              </w:drawing>
-            </w:r>
-          </w:p>
-        </w:tc>
-      </w:tr>
-    </w:tbl>
-    <w:p>
-      <w:pPr>
-        <w:spacing w:after="60"/>
+    <w:p>
+      <w:pPr>
         <w:jc w:val="center"/>
         <w:rPr>
           <w:rFonts w:ascii="Aptos" w:hAnsi="Aptos"/>
@@ -121,27 +11,77 @@
           <w:szCs w:val="48"/>
         </w:rPr>
       </w:pPr>
-      <w:proofErr w:type="spellStart"/>
       <w:r>
         <w:rPr>
           <w:rFonts w:ascii="Aptos" w:hAnsi="Aptos"/>
+          <w:noProof/>
           <w:sz w:val="48"/>
           <w:szCs w:val="48"/>
         </w:rPr>
-        <w:t>Majeng</w:t>
-      </w:r>
-      <w:proofErr w:type="spellEnd"/>
-      <w:r>
-        <w:rPr>
-          <w:rFonts w:ascii="Aptos" w:hAnsi="Aptos"/>
-          <w:sz w:val="48"/>
-          <w:szCs w:val="48"/>
-        </w:rPr>
-        <w:t xml:space="preserve"> LIFE </w:t>
-      </w:r>
-    </w:p>
-    <w:p>
-      <w:pPr>
+        <w:drawing>
+          <wp:anchor distT="0" distB="0" distL="114300" distR="114300" simplePos="0" relativeHeight="251658240" behindDoc="0" locked="0" layoutInCell="1" allowOverlap="1" wp14:anchorId="1E571954" wp14:editId="1F6E79BC">
+            <wp:simplePos x="0" y="0"/>
+            <wp:positionH relativeFrom="margin">
+              <wp:align>center</wp:align>
+            </wp:positionH>
+            <wp:positionV relativeFrom="paragraph">
+              <wp:posOffset>107950</wp:posOffset>
+            </wp:positionV>
+            <wp:extent cx="1800000" cy="507600"/>
+            <wp:effectExtent l="0" t="0" r="0" b="6985"/>
+            <wp:wrapNone/>
+            <wp:docPr id="1503020254" name="Picture 1"/>
+            <wp:cNvGraphicFramePr>
+              <a:graphicFrameLocks xmlns:a="http://schemas.openxmlformats.org/drawingml/2006/main" noChangeAspect="1"/>
+            </wp:cNvGraphicFramePr>
+            <a:graphic xmlns:a="http://schemas.openxmlformats.org/drawingml/2006/main">
+              <a:graphicData uri="http://schemas.openxmlformats.org/drawingml/2006/picture">
+                <pic:pic xmlns:pic="http://schemas.openxmlformats.org/drawingml/2006/picture">
+                  <pic:nvPicPr>
+                    <pic:cNvPr id="0" name="Picture 2"/>
+                    <pic:cNvPicPr>
+                      <a:picLocks noChangeAspect="1" noChangeArrowheads="1"/>
+                    </pic:cNvPicPr>
+                  </pic:nvPicPr>
+                  <pic:blipFill>
+                    <a:blip r:embed="rId7">
+                      <a:extLst>
+                        <a:ext uri="{28A0092B-C50C-407E-A947-70E740481C1C}">
+                          <a14:useLocalDpi xmlns:a14="http://schemas.microsoft.com/office/drawing/2010/main" val="0"/>
+                        </a:ext>
+                      </a:extLst>
+                    </a:blip>
+                    <a:srcRect/>
+                    <a:stretch>
+                      <a:fillRect/>
+                    </a:stretch>
+                  </pic:blipFill>
+                  <pic:spPr bwMode="auto">
+                    <a:xfrm>
+                      <a:off x="0" y="0"/>
+                      <a:ext cx="1800000" cy="507600"/>
+                    </a:xfrm>
+                    <a:prstGeom prst="rect">
+                      <a:avLst/>
+                    </a:prstGeom>
+                    <a:noFill/>
+                  </pic:spPr>
+                </pic:pic>
+              </a:graphicData>
+            </a:graphic>
+            <wp14:sizeRelH relativeFrom="margin">
+              <wp14:pctWidth>0</wp14:pctWidth>
+            </wp14:sizeRelH>
+            <wp14:sizeRelV relativeFrom="margin">
+              <wp14:pctHeight>0</wp14:pctHeight>
+            </wp14:sizeRelV>
+          </wp:anchor>
+        </w:drawing>
+      </w:r>
+    </w:p>
+    <w:p>
+      <w:pPr>
+        <w:spacing w:before="360"/>
         <w:jc w:val="center"/>
       </w:pPr>
       <w:r>
@@ -172,9 +112,6 @@
     <w:p>
       <w:r>
         <w:t xml:space="preserve">Dear </w:t>
-      </w:r>
-      <w:r>
-        <w:t>{name}</w:t>
       </w:r>
     </w:p>
     <w:p>
@@ -253,15 +190,7 @@
     </w:p>
     <w:p>
       <w:r>
-        <w:t xml:space="preserve">Thank you for choosing the </w:t>
-      </w:r>
-      <w:proofErr w:type="spellStart"/>
-      <w:r>
-        <w:t>Majeng</w:t>
-      </w:r>
-      <w:proofErr w:type="spellEnd"/>
-      <w:r>
-        <w:t xml:space="preserve"> Life Funeral P</w:t>
+        <w:t>Thank you for choosing the Majeng Life Funeral P</w:t>
       </w:r>
       <w:r>
         <w:t>olicy</w:t>
@@ -330,7 +259,7 @@
           <w:numId w:val="2"/>
         </w:numPr>
       </w:pPr>
-      <w:hyperlink r:id="rId9" w:history="1">
+      <w:hyperlink r:id="rId8" w:history="1">
         <w:r>
           <w:rPr>
             <w:rStyle w:val="Hyperlink"/>
@@ -402,7 +331,7 @@
         </w:numPr>
       </w:pPr>
       <w:r>
-        <w:t xml:space="preserve">Completed claim form. </w:t>
+        <w:t>Completed claim form</w:t>
       </w:r>
     </w:p>
     <w:p>
@@ -535,7 +464,6 @@
       </w:r>
       <w:r>
         <w:tab/>
-        <w:t>Jane Doe</w:t>
       </w:r>
     </w:p>
     <w:p>
@@ -550,7 +478,6 @@
       </w:r>
       <w:r>
         <w:tab/>
-        <w:t>9005034089085</w:t>
       </w:r>
     </w:p>
     <w:p>
@@ -560,24 +487,11 @@
       <w:r>
         <w:t xml:space="preserve">Contact: </w:t>
       </w:r>
-      <w:r>
-        <w:tab/>
-      </w:r>
-      <w:r>
-        <w:tab/>
-        <w:t xml:space="preserve">082 444 7861 / </w:t>
-      </w:r>
-      <w:hyperlink r:id="rId10" w:history="1">
-        <w:r>
-          <w:rPr>
-            <w:rStyle w:val="Hyperlink"/>
-          </w:rPr>
-          <w:t>Jane@gmail.com</w:t>
-        </w:r>
-      </w:hyperlink>
-      <w:r>
-        <w:t xml:space="preserve"> </w:t>
-      </w:r>
+    </w:p>
+    <w:p>
+      <w:pPr>
+        <w:spacing w:after="60" w:line="240" w:lineRule="auto"/>
+      </w:pPr>
     </w:p>
     <w:p>
       <w:pPr>
@@ -777,17 +691,16 @@
         <w:tblLook w:val="04A0" w:firstRow="1" w:lastRow="0" w:firstColumn="1" w:lastColumn="0" w:noHBand="0" w:noVBand="1"/>
       </w:tblPr>
       <w:tblGrid>
-        <w:gridCol w:w="1411"/>
-        <w:gridCol w:w="1783"/>
-        <w:gridCol w:w="1763"/>
-        <w:gridCol w:w="1388"/>
-        <w:gridCol w:w="1296"/>
-        <w:gridCol w:w="1375"/>
+        <w:gridCol w:w="3114"/>
+        <w:gridCol w:w="1701"/>
+        <w:gridCol w:w="1530"/>
+        <w:gridCol w:w="1447"/>
+        <w:gridCol w:w="1224"/>
       </w:tblGrid>
       <w:tr>
         <w:tc>
           <w:tcPr>
-            <w:tcW w:w="1411" w:type="dxa"/>
+            <w:tcW w:w="3114" w:type="dxa"/>
             <w:shd w:val="clear" w:color="auto" w:fill="747474" w:themeFill="background2" w:themeFillShade="80"/>
           </w:tcPr>
           <w:p>
@@ -815,7 +728,7 @@
         </w:tc>
         <w:tc>
           <w:tcPr>
-            <w:tcW w:w="1783" w:type="dxa"/>
+            <w:tcW w:w="1701" w:type="dxa"/>
             <w:shd w:val="clear" w:color="auto" w:fill="747474" w:themeFill="background2" w:themeFillShade="80"/>
           </w:tcPr>
           <w:p>
@@ -843,7 +756,7 @@
         </w:tc>
         <w:tc>
           <w:tcPr>
-            <w:tcW w:w="1763" w:type="dxa"/>
+            <w:tcW w:w="1530" w:type="dxa"/>
             <w:shd w:val="clear" w:color="auto" w:fill="747474" w:themeFill="background2" w:themeFillShade="80"/>
           </w:tcPr>
           <w:p>
@@ -865,41 +778,13 @@
                 <w:sz w:val="24"/>
                 <w:szCs w:val="24"/>
               </w:rPr>
-              <w:t>Relationship to plan holder</w:t>
+              <w:t>Start Date</w:t>
             </w:r>
           </w:p>
         </w:tc>
         <w:tc>
           <w:tcPr>
-            <w:tcW w:w="1388" w:type="dxa"/>
-            <w:shd w:val="clear" w:color="auto" w:fill="747474" w:themeFill="background2" w:themeFillShade="80"/>
-          </w:tcPr>
-          <w:p>
-            <w:pPr>
-              <w:spacing w:before="60" w:after="60"/>
-              <w:rPr>
-                <w:b/>
-                <w:bCs/>
-                <w:color w:val="FFFFFF" w:themeColor="background1"/>
-                <w:sz w:val="24"/>
-                <w:szCs w:val="24"/>
-              </w:rPr>
-            </w:pPr>
-            <w:r>
-              <w:rPr>
-                <w:b/>
-                <w:bCs/>
-                <w:color w:val="FFFFFF" w:themeColor="background1"/>
-                <w:sz w:val="24"/>
-                <w:szCs w:val="24"/>
-              </w:rPr>
-              <w:t>Start date</w:t>
-            </w:r>
-          </w:p>
-        </w:tc>
-        <w:tc>
-          <w:tcPr>
-            <w:tcW w:w="1296" w:type="dxa"/>
+            <w:tcW w:w="1447" w:type="dxa"/>
             <w:shd w:val="clear" w:color="auto" w:fill="747474" w:themeFill="background2" w:themeFillShade="80"/>
           </w:tcPr>
           <w:p>
@@ -927,7 +812,7 @@
         </w:tc>
         <w:tc>
           <w:tcPr>
-            <w:tcW w:w="1375" w:type="dxa"/>
+            <w:tcW w:w="1224" w:type="dxa"/>
             <w:shd w:val="clear" w:color="auto" w:fill="747474" w:themeFill="background2" w:themeFillShade="80"/>
           </w:tcPr>
           <w:p>
@@ -957,90 +842,54 @@
       <w:tr>
         <w:tc>
           <w:tcPr>
-            <w:tcW w:w="1411" w:type="dxa"/>
+            <w:tcW w:w="3114" w:type="dxa"/>
           </w:tcPr>
           <w:p>
             <w:pPr>
               <w:spacing w:before="60" w:after="60"/>
             </w:pPr>
-            <w:r>
-              <w:t>{name}</w:t>
-            </w:r>
           </w:p>
         </w:tc>
         <w:tc>
           <w:tcPr>
-            <w:tcW w:w="1783" w:type="dxa"/>
+            <w:tcW w:w="1701" w:type="dxa"/>
           </w:tcPr>
           <w:p>
             <w:pPr>
               <w:spacing w:before="60" w:after="60"/>
             </w:pPr>
-            <w:r>
-              <w:t>{</w:t>
-            </w:r>
-            <w:proofErr w:type="spellStart"/>
-            <w:r>
-              <w:t>idNumber</w:t>
-            </w:r>
-            <w:proofErr w:type="spellEnd"/>
-            <w:r>
-              <w:t>}</w:t>
-            </w:r>
           </w:p>
         </w:tc>
         <w:tc>
           <w:tcPr>
-            <w:tcW w:w="1763" w:type="dxa"/>
+            <w:tcW w:w="1530" w:type="dxa"/>
           </w:tcPr>
           <w:p>
             <w:pPr>
               <w:spacing w:before="60" w:after="60"/>
             </w:pPr>
-            <w:r>
-              <w:t>Plan Holder</w:t>
-            </w:r>
           </w:p>
         </w:tc>
         <w:tc>
           <w:tcPr>
-            <w:tcW w:w="1388" w:type="dxa"/>
-          </w:tcPr>
-          <w:p>
-            <w:pPr>
-              <w:spacing w:before="60" w:after="60"/>
-            </w:pPr>
-            <w:r>
-              <w:t>{date}</w:t>
-            </w:r>
-          </w:p>
-        </w:tc>
-        <w:tc>
-          <w:tcPr>
-            <w:tcW w:w="1296" w:type="dxa"/>
+            <w:tcW w:w="1447" w:type="dxa"/>
           </w:tcPr>
           <w:p>
             <w:pPr>
               <w:spacing w:before="60" w:after="60"/>
               <w:jc w:val="right"/>
             </w:pPr>
-            <w:r>
-              <w:t>{coverage}</w:t>
-            </w:r>
           </w:p>
         </w:tc>
         <w:tc>
           <w:tcPr>
-            <w:tcW w:w="1375" w:type="dxa"/>
+            <w:tcW w:w="1224" w:type="dxa"/>
           </w:tcPr>
           <w:p>
             <w:pPr>
               <w:spacing w:before="60" w:after="60"/>
               <w:jc w:val="right"/>
             </w:pPr>
-            <w:r>
-              <w:t>{premium}</w:t>
-            </w:r>
           </w:p>
         </w:tc>
       </w:tr>
@@ -1051,15 +900,7 @@
         <w:jc w:val="both"/>
       </w:pPr>
       <w:r>
-        <w:t xml:space="preserve">Please review your cover from regularly to ensure that your needs are met. Please see the </w:t>
-      </w:r>
-      <w:proofErr w:type="spellStart"/>
-      <w:r>
-        <w:t>Majeng</w:t>
-      </w:r>
-      <w:proofErr w:type="spellEnd"/>
-      <w:r>
-        <w:t xml:space="preserve"> Life Funeral </w:t>
+        <w:t xml:space="preserve">Please review your cover from regularly to ensure that your needs are met. Please see the Majeng Life Funeral </w:t>
       </w:r>
       <w:r>
         <w:t>Policy</w:t>
@@ -1092,7 +933,7 @@
       <w:r>
         <w:t xml:space="preserve">Email: </w:t>
       </w:r>
-      <w:hyperlink r:id="rId11" w:history="1">
+      <w:hyperlink r:id="rId9" w:history="1">
         <w:r>
           <w:rPr>
             <w:rStyle w:val="Hyperlink"/>
@@ -1109,7 +950,7 @@
     <w:p/>
     <w:p/>
     <w:sectPr>
-      <w:footerReference w:type="default" r:id="rId12"/>
+      <w:footerReference w:type="default" r:id="rId10"/>
       <w:pgSz w:w="11906" w:h="16838"/>
       <w:pgMar w:top="851" w:right="1440" w:bottom="1440" w:left="1440" w:header="708" w:footer="708" w:gutter="0"/>
       <w:cols w:space="708"/>

</xml_diff>